<commit_message>
Handle NSIS paths with spaces and polish handbook title
</commit_message>
<xml_diff>
--- a/docs/manual/microPhotoFrame_Handbuch_DE.src.docx
+++ b/docs/manual/microPhotoFrame_Handbuch_DE.src.docx
@@ -1023,9 +1023,6 @@
     <w:qFormat/>
     <w:rsid w:val="00FC693F"/>
     <w:pPr>
-      <w:pBdr>
-        <w:bottom w:val="single" w:sz="8" w:space="4" w:color="4F81BD" w:themeColor="accent1"/>
-      </w:pBdr>
       <w:spacing w:after="300" w:line="240" w:lineRule="auto"/>
       <w:contextualSpacing/>
     </w:pPr>
@@ -1510,9 +1507,6 @@
     <w:qFormat/>
     <w:rsid w:val="00FC693F"/>
     <w:pPr>
-      <w:pBdr>
-        <w:bottom w:val="single" w:sz="4" w:space="4" w:color="4F81BD" w:themeColor="accent1"/>
-      </w:pBdr>
       <w:spacing w:before="200" w:after="280"/>
       <w:ind w:left="936" w:right="936"/>
     </w:pPr>

</xml_diff>

<commit_message>
Fix PHP prerequisite quoting and document automatic server setup
</commit_message>
<xml_diff>
--- a/docs/manual/microPhotoFrame_Handbuch_DE.src.docx
+++ b/docs/manual/microPhotoFrame_Handbuch_DE.src.docx
@@ -30,7 +30,7 @@
     </w:p>
     <w:p>
       <w:r>
-        <w:t>Auf der GitHub-Seite unter Releases stehen getrennte ZIP-Pakete für Node.js, IIS, Apache und Nginx bereit. Für Windows gibt es zusätzlich je Servertyp einen NSIS-Installer als EXE. Die EXE kopiert die Anwendung; Server-Laufzeiten und deren Einrichtung sind weiterhin erforderlich. Ein MSI wird nicht erzeugt.</w:t>
+        <w:t>Auf der GitHub-Seite unter Releases stehen getrennte ZIP-Pakete und vollständige Windows-Installer für Node.js, IIS, Apache und Nginx bereit. Die EXE enthält die benötigten Laufzeiten und richtet den Server automatisch ein. Die ZIP-Pakete sind für eine eigene Serverumgebung gedacht. Für die einfachste Installation verwenden Sie die EXE für Node.js.</w:t>
       </w:r>
     </w:p>
     <w:p>
@@ -84,12 +84,12 @@
     </w:p>
     <w:p>
       <w:r>
-        <w:t>Installieren Sie Node.js mit npm. Entpacken Sie das Node-Paket in ein eigenes Verzeichnis oder führen Sie den Node-EXE-Installer aus. Öffnen Sie anschließend eine Konsole im Unterordner node. Führen Sie npm ci --omit=dev und danach npm start aus. Der Installer versucht die Installation der Abhängigkeiten bereits; bei einer Fehlermeldung holen Sie diesen Schritt nach.</w:t>
+        <w:t>Starten Sie den Node-EXE-Installer als Administrator und wählen Sie das Installationsverzeichnis. Node.js und alle Anwendungsabhängigkeiten werden mitgeliefert. Setup richtet den Windows-Dienst microPhotoFrameNode ein, startet ihn und prüft Startseite sowie API. Eine gesonderte Node.js- oder npm-Installation ist nicht erforderlich.</w:t>
       </w:r>
     </w:p>
     <w:p>
       <w:r>
-        <w:t>Öffnen Sie http://localhost:891 auf dem Serverrechner. Für andere Geräte verwenden Sie dessen LAN-Adresse, zum Beispiel http://192.168.1.20:891. Der Server muss während des Betriebs laufen. Ein Windows-Dienst wird durch den Installer nicht eingerichtet.</w:t>
+        <w:t>Öffnen Sie nach Abschluss die Desktop-Verknüpfung microPhotoFrame oder http://localhost:891. Für den Rahmen verwenden Sie die LAN-Adresse des Serverrechners, zum Beispiel http://192.168.1.20:891. Der Dienst startet automatisch mit Windows und wird bei einem unerwarteten Abbruch neu gestartet.</w:t>
       </w:r>
     </w:p>
     <w:p>
@@ -102,7 +102,7 @@
     </w:p>
     <w:p>
       <w:r>
-        <w:t>Aktivieren Sie IIS mit ASP.NET und installieren Sie URL Rewrite. Legen Sie eine Website mit dem entpackten Anwendungsverzeichnis als Stammverzeichnis und dem gewünschten Port an. web.config, der Ordner aspx und bin/Newtonsoft.Json.dll müssen vorhanden sein. Der Anwendungspool benötigt Schreibrechte für die Bild- und Show-Daten. Die Details stehen in docs/iis_aspx_server.md.</w:t>
+        <w:t>Der IIS-EXE-Installer aktiviert IIS mit ASP.NET, installiert bei Bedarf .NET Framework 4.8 und URL Rewrite und erstellt eine eigene Website mit Anwendungspool auf Port 888. Schreibrechte und Routing werden automatisch gesetzt. Vorhandene fremde IIS-Websites bleiben bestehen. IIS ist nicht auf jeder Windows-Edition verfügbar; auf Windows Home verwenden Sie die Node-Variante.</w:t>
       </w:r>
     </w:p>
     <w:p>
@@ -115,7 +115,7 @@
     </w:p>
     <w:p>
       <w:r>
-        <w:t>Richten Sie Apache mit PHP und mod_rewrite ein. Passen Sie die Pfade in apache/httpd-microPhotoFrame.conf an das Installationsverzeichnis an und binden Sie die Konfiguration ein. Beachten Sie die Freigabe von .htaccess und die Schreibrechte für shows. Die Anleitung docs/Apache_PHP_server.md beschreibt die Einrichtung und benötigten PHP-Erweiterungen.</w:t>
+        <w:t>Der Apache-EXE-Installer enthält Apache, die passende Thread-Safe-Version von PHP und die Visual-C++-Laufzeit. Setup erstellt eine eigene Konfiguration für das gewählte Verzeichnis, aktiviert die benötigten PHP-Erweiterungen und startet den Dienst microPhotoFrameApache auf Port 889.</w:t>
       </w:r>
     </w:p>
     <w:p>
@@ -128,12 +128,12 @@
     </w:p>
     <w:p>
       <w:r>
-        <w:t>Richten Sie Nginx und PHP-CGI ein. Passen Sie nginx/microPhotoFrame.conf an die tatsächlichen Pfade und den PHP-CGI-Port an. Starten Sie PHP-CGI und anschließend Nginx. Die mitgelieferten Windows-Startdateien müssen zu Ihrer Installation passen. Weitere Schritte stehen in docs/NGINX_PHP_server.md.</w:t>
+        <w:t>Der Nginx-EXE-Installer enthält Nginx, PHP-CGI und die Visual-C++-Laufzeit. Setup erstellt und startet die Dienste microPhotoFramePHP und microPhotoFrameNginx. Der Webserver verwendet Port 890; PHP-CGI ist ausschließlich lokal auf Port 9089 erreichbar.</w:t>
       </w:r>
     </w:p>
     <w:p>
       <w:r>
-        <w:t>Prüfen Sie den Zugriff vom WLAN aus. localhost bezeichnet immer das gerade verwendete Gerät und ist deshalb keine geeignete Server-Adresse für den Rahmen. Halten Sie diese Installation im vertrauenswürdigen lokalen Netz; eine öffentliche Bereitstellung erfordert eine gesonderte Absicherung.</w:t>
+        <w:t>Setup öffnet den jeweiligen Serverport in der Windows-Firewall für das lokale Subnetz in privaten und Domänennetzwerken. Ist Ihr Heimnetz als öffentlich eingestuft, stellen Sie es in den Windows-Netzwerkeinstellungen auf privat. Die Installation ist für das lokale Netz vorgesehen. Nach einem erforderlichen Windows-Neustart setzt sich die Einrichtung automatisch fort. Bei einem belegten Port oder einem Einrichtungsfehler meldet Setup einen Fehler; Details stehen unter logs/setup.log.</w:t>
       </w:r>
     </w:p>
     <w:p>
@@ -241,12 +241,12 @@
     </w:p>
     <w:p>
       <w:r>
-        <w:t>Sichern Sie shows, config.json und angepasste Serverkonfigurationen vor jeder Aktualisierung. Beenden Sie den Server und installieren oder entpacken Sie die neue Version. Prüfen Sie danach Serverstart, Show-Auswahl und Abruf durch ein Gerät. Der Windows-Installer erhält eine vorhandene config.json; eigene Anpassungen anderer ausgelieferter Dateien müssen Sie bei Bedarf wieder übernehmen.</w:t>
+        <w:t>Sichern Sie shows, config.json und eigene Anpassungen vor einer Aktualisierung. Starten Sie den neuen EXE-Installer mit demselben Zielverzeichnis. Er stoppt die eigenen Dienste, aktualisiert Laufzeiten und Anwendung und richtet den gewählten Server erneut ein. Shows und config.json bleiben erhalten. Automatisch erzeugte Serverkonfigurationen werden erneuert; ihre vorherige Fassung bleibt als .before-setup erhalten.</w:t>
       </w:r>
     </w:p>
     <w:p>
       <w:r>
-        <w:t>Firmware wird mit dem neuen gerätespezifischen Paket erneut installiert. Bewahren Sie die vorherige Version und vorhandene Originalfirmware auf. Die Deinstallation des Servers erhält shows und config.json; kontrollieren Sie verbleibende Dateien vor einer manuellen Bereinigung.</w:t>
+        <w:t>Firmware wird mit dem neuen gerätespezifischen Paket erneut installiert. Bewahren Sie die vorherige Version und vorhandene Originalfirmware auf. Die Server-Deinstallation entfernt die eigenen Dienste, die eigene IIS-Website, Firewall-Regeln und mitgelieferten Laufzeiten. Shows, config.json und Protokolle bleiben erhalten. Gemeinsam genutzte Windows-Komponenten wie IIS, .NET und Visual C++ werden nicht entfernt.</w:t>
       </w:r>
     </w:p>
     <w:p>

</xml_diff>

<commit_message>
Release 1.3.0: keep the last photo when the server is offline and add Waveshare 1.54G.
Co-authored-by: Cursor <cursoragent@cursor.com>
</commit_message>
<xml_diff>
--- a/docs/manual/microPhotoFrame_Handbuch_DE.src.docx
+++ b/docs/manual/microPhotoFrame_Handbuch_DE.src.docx
@@ -17,7 +17,7 @@
     </w:p>
     <w:p>
       <w:r>
-        <w:t>Dieses Handbuch führt von der Auswahl des Server-Pakets bis zur ersten Bildershow auf einem reTerminal E1002 oder NeoFrame. Ein ständig erreichbarer Server verwaltet Bilder und Shows; der Rahmen lädt seine Bilder über WLAN. Installieren Sie zuerst den Server, dann die Firmware für Ihr genaues Gerätemodell.</w:t>
+        <w:t>Dieses Handbuch führt von der Auswahl des Server-Pakets bis zur ersten Bildershow auf einem reTerminal E1002, NeoFrame oder Waveshare 1.54G. Ein ständig erreichbarer Server verwaltet Bilder und Shows; der Rahmen lädt seine Bilder über WLAN. Installieren Sie zuerst den Server, dann die Firmware für Ihr genaues Gerätemodell.</w:t>
       </w:r>
     </w:p>
     <w:p>
@@ -40,7 +40,7 @@
     </w:p>
     <w:p>
       <w:r>
-        <w:t>Firmware-Pakete tragen reterminal-e1002 oder neoframe im Dateinamen. Ein eigenes E1001-Release ist derzeit nicht eingerichtet. Eine ähnliche Displaygröße oder derselbe ESP32-Chip macht Firmware nicht austauschbar.</w:t>
+        <w:t>Firmware-Pakete tragen reterminal-e1002, neoframe oder waveshare-154g im Dateinamen. Ein eigenes E1001-Release ist derzeit nicht eingerichtet. Eine ähnliche Displaygröße oder derselbe ESP32-Chip macht Firmware nicht austauschbar.</w:t>
       </w:r>
     </w:p>
     <w:p>
@@ -200,7 +200,7 @@
     </w:p>
     <w:p>
       <w:r>
-        <w:t>NeoFrame bietet nach dem Einschalten ein fünfminütiges Konfigurationsfenster. Falls die Oberfläche nicht mehr erreichbar ist, schalten Sie das Gerät erneut ein. Für die Server-URL verwenden Sie die LAN-Adresse und den Port Ihres Servers, nicht localhost.</w:t>
+        <w:t>NeoFrame und Waveshare 1.54G bieten nach dem Einschalten ein fünfminütiges Konfigurationsfenster (keine Taster). Falls die Oberfläche nicht mehr erreichbar ist, schalten Sie das Gerät erneut ein. Für die Server-URL verwenden Sie die LAN-Adresse und den Port Ihres Servers, nicht localhost.</w:t>
       </w:r>
     </w:p>
     <w:p>
@@ -218,7 +218,7 @@
     </w:p>
     <w:p>
       <w:r>
-        <w:t>Öffnen Sie die Serveroberfläche im Browser. Legen Sie eine Show an, wählen Sie den passenden Displaytyp und importieren Sie Bilder. E1002 und NeoFrame nutzen das Spectra-6-Display mit 800 × 480 Pixeln und Display-ID I. Prüfen Sie Bildausschnitt und Ausrichtung vor dem Speichern.</w:t>
+        <w:t>Öffnen Sie die Serveroberfläche im Browser. Legen Sie eine Show an, wählen Sie den passenden Displaytyp und importieren Sie Bilder. E1002 und NeoFrame nutzen das Spectra-6-Display mit 800 × 480 Pixeln und Display-ID I. Waveshare 1.54G nutzt 200 × 200 Pixel, vier Farben (Schwarz/Weiß/Rot/Gelb) und Display-ID f. Prüfen Sie Bildausschnitt und Ausrichtung vor dem Speichern. Statustexte folgen der Rahmenausrichtung. Ist der Server nicht erreichbar, bleibt das zuletzt geladene Bild sichtbar.</w:t>
       </w:r>
     </w:p>
     <w:p>
@@ -269,7 +269,7 @@
     </w:p>
     <w:p>
       <w:r>
-        <w:t>Keine Bilder auf dem Rahmen: Server-URL, aktive Show und Displaytyp prüfen. Bei Firmware-Problemen den seriellen Monitor mit 115200 Baud verwenden. Gerätebezogene Wiederherstellungsdateien gehören in firmware/factory/&lt;gerät&gt;; Originalimages sind nicht Bestandteil dieses Releases.</w:t>
+        <w:t>Keine Bilder auf dem Rahmen: Server-URL, aktive Show und Displaytyp prüfen. Bei ausgeschaltetem Server bleibt das zuletzt geladene Bild stehen. Bei Firmware-Problemen den seriellen Monitor mit 115200 Baud verwenden. Gerätebezogene Wiederherstellungsdateien gehören in firmware/factory/&lt;gerät&gt;; Originalimages sind nicht Bestandteil dieses Releases.</w:t>
       </w:r>
     </w:p>
     <w:sectPr>

</xml_diff>